<commit_message>
docs: HD bản 10 bỏ viện dẫn ý kiến TCCB ngày 06/10 tại mã cảnh báo thang điểm
Co-Authored-By: Claude Opus 5.5 <noreply@anthropic.com>
</commit_message>
<xml_diff>
--- a/30-Ket-Qua/2026-10-12/Soan-Thao/HD_Huong-dan-chi-tiet-su-dung-KTC-Quan-tri_20261012_v10_TrackChanges.docx
+++ b/30-Ket-Qua/2026-10-12/Soan-Thao/HD_Huong-dan-chi-tiet-su-dung-KTC-Quan-tri_20261012_v10_TrackChanges.docx
@@ -2388,12 +2388,12 @@
       <w:r>
         <w:t xml:space="preserve">KTC-Quan-tri là bộ công cụ trí tuệ nhân tạo hỗ trợ chu trình quản trị nhiệm vụ khép kín của Trường: Kế hoạch - giao việc - theo dõi - kết quả, minh chứng - báo cáo - đánh giá. Bộ công cụ dùng chung kho KTC-Database, mẫu Phụ lục Thông báo số 736/TB-CĐKT ngày 25/6/2026, 6 trục kết quả trọng tâm theo Thông báo số 817/TB-CĐKT ngày 14/7/2026 </w:t>
       </w:r>
-      <w:del w:id="1001" w:author="Tiếp thu thẩm định lần 2, 12/10 (Claude)" w:date="2026-10-12T07:12:04Z">
+      <w:del w:id="1003" w:author="Tiếp thu thẩm định lần 2, 12/10 (Claude)" w:date="2026-10-12T07:18:07Z">
         <w:r>
           <w:delText xml:space="preserve">và mã nhiệm vụ (Task_ID) thống nhất từ kế hoạch đến báo cáo.</w:delText>
         </w:r>
       </w:del>
-      <w:ins w:id="1002" w:author="Tiếp thu thẩm định lần 2, 12/10 (Claude)" w:date="2026-10-12T07:12:04Z">
+      <w:ins w:id="1004" w:author="Tiếp thu thẩm định lần 2, 12/10 (Claude)" w:date="2026-10-12T07:18:07Z">
         <w:r>
           <w:t xml:space="preserve">và mã sản phẩm, công việc theo Danh mục sản phẩm, công việc ban hành kèm theo Quyết định số 2119/QĐ-CĐKT ngày 28/9/2026; mã nhiệm vụ thống nhất (Task_ID) chưa áp dụng cho đến khi Trường ban hành quy định mã nhiệm vụ phù hợp với mã nhiệm vụ trên phần mềm KPI của tỉnh (Hệ thống quản lý đánh giá, xếp loại chất lượng cán bộ, công chức, viên chức VNPT-ĐGCB), trong thời gian này nhiệm vụ được đối chiếu theo mã sản phẩm và tên nhiệm vụ.</w:t>
         </w:r>
@@ -2786,7 +2786,7 @@
             <w:pPr>
               <w:spacing w:before="40" w:after="40" w:line="252" w:lineRule="auto"/>
             </w:pPr>
-            <w:del w:id="1003" w:author="Tiếp thu thẩm định lần 2, 12/10 (Claude)" w:date="2026-10-12T07:12:04Z">
+            <w:del w:id="1005" w:author="Tiếp thu thẩm định lần 2, 12/10 (Claude)" w:date="2026-10-12T07:18:07Z">
               <w:r>
                 <w:rPr>
                   <w:sz w:val="24"/>
@@ -2795,7 +2795,7 @@
                 <w:delText xml:space="preserve">Chuẩn hóa nhiệm vụ, cấp Task_ID, phân loại trục</w:delText>
               </w:r>
             </w:del>
-            <w:ins w:id="1004" w:author="Tiếp thu thẩm định lần 2, 12/10 (Claude)" w:date="2026-10-12T07:12:04Z">
+            <w:ins w:id="1006" w:author="Tiếp thu thẩm định lần 2, 12/10 (Claude)" w:date="2026-10-12T07:18:07Z">
               <w:r>
                 <w:rPr>
                   <w:sz w:val="24"/>
@@ -3504,7 +3504,7 @@
               </w:rPr>
               <w:t xml:space="preserve">Tự chạy khi mở, kết thúc phiên và sau khi tạo tệp: In phiên bản và tự thử thao tác chặn ghi; chặn thao tác ghi, xóa đã nhận dạng được vào kho KTC-Database, 03-Templates(1), 04-Good-Documents, </w:t>
             </w:r>
-            <w:del w:id="1019" w:author="Tiếp thu thẩm định lần 2, 12/10 (Claude)" w:date="2026-10-12T07:12:04Z">
+            <w:del w:id="1021" w:author="Tiếp thu thẩm định lần 2, 12/10 (Claude)" w:date="2026-10-12T07:18:07Z">
               <w:r>
                 <w:rPr>
                   <w:sz w:val="24"/>
@@ -3513,7 +3513,7 @@
                 <w:delText xml:space="preserve">kể cả thao tác không xác định được nơi ghi; đo thể thức</w:delText>
               </w:r>
             </w:del>
-            <w:ins w:id="1020" w:author="Tiếp thu thẩm định lần 2, 12/10 (Claude)" w:date="2026-10-12T07:12:04Z">
+            <w:ins w:id="1022" w:author="Tiếp thu thẩm định lần 2, 12/10 (Claude)" w:date="2026-10-12T07:18:07Z">
               <w:r>
                 <w:rPr>
                   <w:sz w:val="24"/>
@@ -4086,12 +4086,12 @@
         <w:ind w:firstLine="720"/>
         <w:jc w:val="both"/>
       </w:pPr>
-      <w:del w:id="1021" w:author="Tiếp thu thẩm định lần 2, 12/10 (Claude)" w:date="2026-10-12T07:12:04Z">
+      <w:del w:id="1023" w:author="Tiếp thu thẩm định lần 2, 12/10 (Claude)" w:date="2026-10-12T07:18:07Z">
         <w:r>
           <w:delText xml:space="preserve">Kết quả kiểm thử gắn với phiên bản, mô hình đã chạy.</w:delText>
         </w:r>
       </w:del>
-      <w:ins w:id="1022" w:author="Tiếp thu thẩm định lần 2, 12/10 (Claude)" w:date="2026-10-12T07:12:04Z">
+      <w:ins w:id="1024" w:author="Tiếp thu thẩm định lần 2, 12/10 (Claude)" w:date="2026-10-12T07:18:07Z">
         <w:r>
           <w:t xml:space="preserve">Kết quả thử nghiệm sơ bộ, gắn với phiên bản, mô hình đã chạy; không phải chứng nhận độ tin cậy trong vận hành.</w:t>
         </w:r>
@@ -4449,12 +4449,12 @@
       <w:r>
         <w:t xml:space="preserve">Chọn marketplace có sẵn hoặc tạo mới (ví dụ: KTC); kéo thả hoặc chọn tệp ktc-quan-tri-&lt;phiên bản&gt;.zip </w:t>
       </w:r>
-      <w:del w:id="1023" w:author="Tiếp thu thẩm định lần 2, 12/10 (Claude)" w:date="2026-10-12T07:12:04Z">
+      <w:del w:id="1025" w:author="Tiếp thu thẩm định lần 2, 12/10 (Claude)" w:date="2026-10-12T07:18:07Z">
         <w:r>
           <w:delText xml:space="preserve">(tối đa 50 MB)</w:delText>
         </w:r>
       </w:del>
-      <w:ins w:id="1024" w:author="Tiếp thu thẩm định lần 2, 12/10 (Claude)" w:date="2026-10-12T07:12:04Z">
+      <w:ins w:id="1026" w:author="Tiếp thu thẩm định lần 2, 12/10 (Claude)" w:date="2026-10-12T07:18:07Z">
         <w:r>
           <w:t xml:space="preserve">(dưới 200 MB)</w:t>
         </w:r>
@@ -4491,12 +4491,12 @@
         </w:rPr>
         <w:t xml:space="preserve">Bước 4 - cập nhật: </w:t>
       </w:r>
-      <w:del w:id="1025" w:author="Tiếp thu thẩm định lần 2, 12/10 (Claude)" w:date="2026-10-12T07:12:04Z">
+      <w:del w:id="1027" w:author="Tiếp thu thẩm định lần 2, 12/10 (Claude)" w:date="2026-10-12T07:18:07Z">
         <w:r>
           <w:delText xml:space="preserve">Gỡ phiên bản cũ trước, tải phiên bản mới, thông báo</w:delText>
         </w:r>
       </w:del>
-      <w:ins w:id="1026" w:author="Tiếp thu thẩm định lần 2, 12/10 (Claude)" w:date="2026-10-12T07:12:04Z">
+      <w:ins w:id="1028" w:author="Tiếp thu thẩm định lần 2, 12/10 (Claude)" w:date="2026-10-12T07:18:07Z">
         <w:r>
           <w:t xml:space="preserve">Tải tệp phiên bản mới cùng tên lên (hệ thống tự ghi đè phiên bản trước, không cần gỡ), thông báo</w:t>
         </w:r>
@@ -4504,12 +4504,12 @@
       <w:r>
         <w:t xml:space="preserve"> người dùng mở cuộc hội thoại mới. Không để song song hai phiên bản. Phiên bản mới phát sinh lỗi: </w:t>
       </w:r>
-      <w:del w:id="1027" w:author="Tiếp thu thẩm định lần 2, 12/10 (Claude)" w:date="2026-10-12T07:12:04Z">
+      <w:del w:id="1029" w:author="Tiếp thu thẩm định lần 2, 12/10 (Claude)" w:date="2026-10-12T07:18:07Z">
         <w:r>
           <w:delText xml:space="preserve">Gỡ phiên bản đó, cài lại phiên bản liền trước</w:delText>
         </w:r>
       </w:del>
-      <w:ins w:id="1028" w:author="Tiếp thu thẩm định lần 2, 12/10 (Claude)" w:date="2026-10-12T07:12:04Z">
+      <w:ins w:id="1030" w:author="Tiếp thu thẩm định lần 2, 12/10 (Claude)" w:date="2026-10-12T07:18:07Z">
         <w:r>
           <w:t xml:space="preserve">Tải lại tệp phiên bản liền trước</w:t>
         </w:r>
@@ -5194,7 +5194,7 @@
               </w:rPr>
               <w:t xml:space="preserve">Chỉ có phần hướng dẫn của kỹ năng; không có tác tử kiểm tra, thao tác tự động; không bảo đảm chạy được công cụ tính toán; chỉ đối chiếu được KTC-Database khi đã kết nối Google Drive. </w:t>
             </w:r>
-            <w:del w:id="1033" w:author="Tiếp thu thẩm định lần 2, 12/10 (Claude)" w:date="2026-10-12T07:12:04Z">
+            <w:del w:id="1035" w:author="Tiếp thu thẩm định lần 2, 12/10 (Claude)" w:date="2026-10-12T07:18:07Z">
               <w:r>
                 <w:rPr>
                   <w:sz w:val="24"/>
@@ -5203,7 +5203,7 @@
                 <w:delText xml:space="preserve">Kết quả chỉ dùng đối chiếu chéo, không thay kết quả trên Claude.</w:delText>
               </w:r>
             </w:del>
-            <w:ins w:id="1034" w:author="Tiếp thu thẩm định lần 2, 12/10 (Claude)" w:date="2026-10-12T07:12:04Z">
+            <w:ins w:id="1036" w:author="Tiếp thu thẩm định lần 2, 12/10 (Claude)" w:date="2026-10-12T07:18:07Z">
               <w:r>
                 <w:rPr>
                   <w:sz w:val="24"/>
@@ -5481,7 +5481,20 @@
         <w:jc w:val="both"/>
       </w:pPr>
       <w:r>
-        <w:t>Mã cảnh báo thường gặp: THIEU_DU_LIEU (thiếu nguồn); NGHI_CHI_DAN_TRONG_DU_LIEU (tệp có câu lệnh bất thường - kiểm tra lại nguồn tệp); DOI_CHIEU_GAN_DUNG (đối chiếu theo tên, chưa theo Task_ID - đơn vị đối chiếu thủ công toàn bộ với dữ liệu gốc trước khi Lãnh đạo đơn vị ký duyệt); FORMAT_BINARY_UNVERIFIED (chưa đo được thể thức - người dùng mở tệp trong Word, kiểm tra khổ A4, lề trên 2 - dưới 2 - trái 3 - phải 2 cm, phông Times New Roman cỡ 14, số trang ở giữa lề trên trước khi trình); THANG_DIEM_CHUA_PHAN_DINH (phép nhân hệ số sản phẩm theo Danh mục ban hành kèm Quyết định số 2119/QĐ-CĐKT với hệ số mức độ công việc không áp dụng: Theo ý kiến của Phòng TCCB&amp;CTHSSV ngày 06/10/2026, từ Quý IV/2026 khối lượng KPI cá nhân quy đổi chỉ theo hệ số sản phẩm, người dùng chọn phương án “A”, không dùng phương án “AxB” cho số liệu chính thức); MA_DON_VI_KHONG_HOP_LE (tên đơn vị không ánh xạ được về mã chuẩn).</w:t>
+        <w:t xml:space="preserve">Mã cảnh báo thường gặp: THIEU_DU_LIEU (thiếu nguồn); NGHI_CHI_DAN_TRONG_DU_LIEU (tệp có câu lệnh bất thường - kiểm tra lại nguồn tệp); DOI_CHIEU_GAN_DUNG (đối chiếu theo tên, chưa theo Task_ID - đơn vị đối chiếu thủ công toàn bộ với dữ liệu gốc trước khi Lãnh đạo đơn vị ký duyệt); FORMAT_BINARY_UNVERIFIED (chưa đo được thể thức - người dùng mở tệp trong Word, kiểm tra khổ A4, lề trên 2 - dưới 2 - trái 3 - phải 2 cm, phông Times New Roman cỡ 14, số trang ở giữa lề trên trước khi trình); THANG_DIEM_CHUA_PHAN_DINH (phép nhân hệ số sản phẩm theo Danh mục ban hành kèm Quyết định số 2119/QĐ-CĐKT với hệ số mức độ công việc </w:t>
+      </w:r>
+      <w:del w:id="1001" w:author="Tiếp thu thẩm định lần 2, 12/10 (Claude)" w:date="2026-10-12T07:18:07Z">
+        <w:r>
+          <w:delText xml:space="preserve">không áp dụng: Theo ý kiến của Phòng TCCB&amp;CTHSSV ngày 06/10/2026, từ Quý IV/2026</w:delText>
+        </w:r>
+      </w:del>
+      <w:ins w:id="1002" w:author="Tiếp thu thẩm định lần 2, 12/10 (Claude)" w:date="2026-10-12T07:18:07Z">
+        <w:r>
+          <w:t xml:space="preserve">không áp dụng: Từ Quý IV/2026</w:t>
+        </w:r>
+      </w:ins>
+      <w:r>
+        <w:t xml:space="preserve"> khối lượng KPI cá nhân quy đổi chỉ theo hệ số sản phẩm, người dùng chọn phương án “A”, không dùng phương án “AxB” cho số liệu chính thức); MA_DON_VI_KHONG_HOP_LE (tên đơn vị không ánh xạ được về mã chuẩn).</w:t>
       </w:r>
     </w:p>
     <w:p>
@@ -6484,7 +6497,7 @@
               </w:rPr>
               <w:t xml:space="preserve">Dùng bộ công cụ KTC-Quan-tri, kỹ năng theo dõi nhiệm vụ (theo-doi-cv). Đầu vào: </w:t>
             </w:r>
-            <w:del w:id="1005" w:author="Tiếp thu thẩm định lần 2, 12/10 (Claude)" w:date="2026-10-12T07:12:04Z">
+            <w:del w:id="1007" w:author="Tiếp thu thẩm định lần 2, 12/10 (Claude)" w:date="2026-10-12T07:18:07Z">
               <w:r>
                 <w:rPr>
                   <w:sz w:val="24"/>
@@ -6493,7 +6506,7 @@
                 <w:delText xml:space="preserve">[danh sách nhiệm vụ có Task_ID]</w:delText>
               </w:r>
             </w:del>
-            <w:ins w:id="1006" w:author="Tiếp thu thẩm định lần 2, 12/10 (Claude)" w:date="2026-10-12T07:12:04Z">
+            <w:ins w:id="1008" w:author="Tiếp thu thẩm định lần 2, 12/10 (Claude)" w:date="2026-10-12T07:18:07Z">
               <w:r>
                 <w:rPr>
                   <w:sz w:val="24"/>
@@ -7094,7 +7107,7 @@
               </w:rPr>
               <w:t xml:space="preserve">Dùng bộ công cụ KTC-Quan-tri, kỹ năng soạn thảo văn bản (soan-thao-vb) và chuẩn thể thức (the-thuc). Loại văn bản: [..]; nội dung chính: [..]; người ký: [..]; nơi nhận: [..]. Yêu cầu: (1) tìm văn bản cùng loại đã ban hành trong KTC-Database làm nền; (2) căn cứ lấy từ kho, ghi đúng số hiệu, ngày ban hành; </w:t>
             </w:r>
-            <w:del w:id="1007" w:author="Tiếp thu thẩm định lần 2, 12/10 (Claude)" w:date="2026-10-12T07:12:04Z">
+            <w:del w:id="1009" w:author="Tiếp thu thẩm định lần 2, 12/10 (Claude)" w:date="2026-10-12T07:18:07Z">
               <w:r>
                 <w:rPr>
                   <w:sz w:val="24"/>
@@ -7103,7 +7116,7 @@
                 <w:delText xml:space="preserve">(3) áp dụng checklist của Skill “ktc-ra-soat-897” ngay khi viết;</w:delText>
               </w:r>
             </w:del>
-            <w:ins w:id="1008" w:author="Tiếp thu thẩm định lần 2, 12/10 (Claude)" w:date="2026-10-12T07:12:04Z">
+            <w:ins w:id="1010" w:author="Tiếp thu thẩm định lần 2, 12/10 (Claude)" w:date="2026-10-12T07:18:07Z">
               <w:r>
                 <w:rPr>
                   <w:sz w:val="24"/>
@@ -7230,7 +7243,7 @@
               </w:rPr>
               <w:t xml:space="preserve">Chuẩn hóa danh sách nhiệm vụ đính kèm: </w:t>
             </w:r>
-            <w:del w:id="1009" w:author="Tiếp thu thẩm định lần 2, 12/10 (Claude)" w:date="2026-10-12T07:12:04Z">
+            <w:del w:id="1011" w:author="Tiếp thu thẩm định lần 2, 12/10 (Claude)" w:date="2026-10-12T07:18:07Z">
               <w:r>
                 <w:rPr>
                   <w:sz w:val="24"/>
@@ -7239,7 +7252,7 @@
                 <w:delText xml:space="preserve">Cấp Task_ID, chuẩn hóa mã đơn vị</w:delText>
               </w:r>
             </w:del>
-            <w:ins w:id="1010" w:author="Tiếp thu thẩm định lần 2, 12/10 (Claude)" w:date="2026-10-12T07:12:04Z">
+            <w:ins w:id="1012" w:author="Tiếp thu thẩm định lần 2, 12/10 (Claude)" w:date="2026-10-12T07:18:07Z">
               <w:r>
                 <w:rPr>
                   <w:sz w:val="24"/>
@@ -7339,7 +7352,7 @@
               </w:rPr>
               <w:t xml:space="preserve">Dùng bộ công cụ KTC-Quan-tri, kỹ năng quản trị (quan-tri). Đầu vào: [kết luận giao ban/văn bản giao việc/danh sách nhiệm vụ]. Yêu cầu: (1) tách từng nhiệm vụ: Nội dung, đơn vị chủ trì, phối hợp, sản phẩm, thời hạn, căn cứ; (2) kiểm tra trùng với nhiệm vụ đã có; </w:t>
             </w:r>
-            <w:del w:id="1011" w:author="Tiếp thu thẩm định lần 2, 12/10 (Claude)" w:date="2026-10-12T07:12:04Z">
+            <w:del w:id="1013" w:author="Tiếp thu thẩm định lần 2, 12/10 (Claude)" w:date="2026-10-12T07:18:07Z">
               <w:r>
                 <w:rPr>
                   <w:sz w:val="24"/>
@@ -7348,7 +7361,7 @@
                 <w:delText xml:space="preserve">(3) cấp Task_ID (dạng KTC-2026-Q4-00125) cho nhiệm vụ mới;</w:delText>
               </w:r>
             </w:del>
-            <w:ins w:id="1012" w:author="Tiếp thu thẩm định lần 2, 12/10 (Claude)" w:date="2026-10-12T07:12:04Z">
+            <w:ins w:id="1014" w:author="Tiếp thu thẩm định lần 2, 12/10 (Claude)" w:date="2026-10-12T07:18:07Z">
               <w:r>
                 <w:rPr>
                   <w:sz w:val="24"/>
@@ -7559,7 +7572,7 @@
               </w:rPr>
               <w:t xml:space="preserve">Dùng bộ công cụ KTC-Quan-tri, tác tử kiểm hồ sơ đơn vị (ktc-kiem-ho-so-don-vi), mỗi đơn vị một lượt. Kiểm đúng mẫu Phụ lục Thông báo số 736/TB-CĐKT, </w:t>
             </w:r>
-            <w:del w:id="1013" w:author="Tiếp thu thẩm định lần 2, 12/10 (Claude)" w:date="2026-10-12T07:12:04Z">
+            <w:del w:id="1015" w:author="Tiếp thu thẩm định lần 2, 12/10 (Claude)" w:date="2026-10-12T07:18:07Z">
               <w:r>
                 <w:rPr>
                   <w:sz w:val="24"/>
@@ -7568,7 +7581,7 @@
                 <w:delText xml:space="preserve">cột Task_ID, mã đơn vị chuẩn</w:delText>
               </w:r>
             </w:del>
-            <w:ins w:id="1014" w:author="Tiếp thu thẩm định lần 2, 12/10 (Claude)" w:date="2026-10-12T07:12:04Z">
+            <w:ins w:id="1016" w:author="Tiếp thu thẩm định lần 2, 12/10 (Claude)" w:date="2026-10-12T07:18:07Z">
               <w:r>
                 <w:rPr>
                   <w:sz w:val="24"/>
@@ -7838,7 +7851,7 @@
             <w:pPr>
               <w:spacing w:before="40" w:after="40" w:line="252" w:lineRule="auto"/>
             </w:pPr>
-            <w:del w:id="1015" w:author="Tiếp thu thẩm định lần 2, 12/10 (Claude)" w:date="2026-10-12T07:12:04Z">
+            <w:del w:id="1017" w:author="Tiếp thu thẩm định lần 2, 12/10 (Claude)" w:date="2026-10-12T07:18:07Z">
               <w:r>
                 <w:rPr>
                   <w:sz w:val="24"/>
@@ -7847,7 +7860,7 @@
                 <w:delText xml:space="preserve">Danh sách nhiệm vụ có Task_ID;</w:delText>
               </w:r>
             </w:del>
-            <w:ins w:id="1016" w:author="Tiếp thu thẩm định lần 2, 12/10 (Claude)" w:date="2026-10-12T07:12:04Z">
+            <w:ins w:id="1018" w:author="Tiếp thu thẩm định lần 2, 12/10 (Claude)" w:date="2026-10-12T07:18:07Z">
               <w:r>
                 <w:rPr>
                   <w:sz w:val="24"/>
@@ -8215,7 +8228,7 @@
             <w:pPr>
               <w:spacing w:before="40" w:after="40" w:line="252" w:lineRule="auto"/>
             </w:pPr>
-            <w:del w:id="1017" w:author="Tiếp thu thẩm định lần 2, 12/10 (Claude)" w:date="2026-10-12T07:12:04Z">
+            <w:del w:id="1019" w:author="Tiếp thu thẩm định lần 2, 12/10 (Claude)" w:date="2026-10-12T07:18:07Z">
               <w:r>
                 <w:rPr>
                   <w:sz w:val="24"/>
@@ -8224,7 +8237,7 @@
                 <w:delText>Task_ID dạng KTC-2026-Q4-00125, dùng xuyên suốt kế hoạch, theo dõi, báo cáo, minh chứng.</w:delText>
               </w:r>
             </w:del>
-            <w:ins w:id="1018" w:author="Tiếp thu thẩm định lần 2, 12/10 (Claude)" w:date="2026-10-12T07:12:04Z">
+            <w:ins w:id="1020" w:author="Tiếp thu thẩm định lần 2, 12/10 (Claude)" w:date="2026-10-12T07:18:07Z">
               <w:r>
                 <w:rPr>
                   <w:sz w:val="24"/>
@@ -8597,7 +8610,7 @@
             <w:pPr>
               <w:spacing w:before="40" w:after="40" w:line="252" w:lineRule="auto"/>
             </w:pPr>
-            <w:del w:id="1029" w:author="Tiếp thu thẩm định lần 2, 12/10 (Claude)" w:date="2026-10-12T07:12:04Z">
+            <w:del w:id="1031" w:author="Tiếp thu thẩm định lần 2, 12/10 (Claude)" w:date="2026-10-12T07:18:07Z">
               <w:r>
                 <w:rPr>
                   <w:sz w:val="24"/>
@@ -8606,7 +8619,7 @@
                 <w:delText>Gỡ bản cũ, chỉ giữ bản mới nhất; mở cuộc hội thoại mới.</w:delText>
               </w:r>
             </w:del>
-            <w:ins w:id="1030" w:author="Tiếp thu thẩm định lần 2, 12/10 (Claude)" w:date="2026-10-12T07:12:04Z">
+            <w:ins w:id="1032" w:author="Tiếp thu thẩm định lần 2, 12/10 (Claude)" w:date="2026-10-12T07:18:07Z">
               <w:r>
                 <w:rPr>
                   <w:sz w:val="24"/>
@@ -9080,12 +9093,12 @@
       <w:r>
         <w:t xml:space="preserve">- Phân loại dữ liệu: (1) văn bản đã ban hành, công khai - được dùng; (2) dữ liệu nội bộ (kế hoạch, báo cáo đơn vị) - chỉ dùng trong tài khoản Claude AI Team của Trường; (3) dữ liệu cá nhân (điểm, nhận xét, xếp loại) - chỉ người được đánh giá và người có thẩm quyền xử lý, trong tài khoản Claude AI Team của Trường, tối thiểu hóa, không dùng #học; </w:t>
       </w:r>
-      <w:del w:id="1031" w:author="Tiếp thu thẩm định lần 2, 12/10 (Claude)" w:date="2026-10-12T07:12:04Z">
+      <w:del w:id="1033" w:author="Tiếp thu thẩm định lần 2, 12/10 (Claude)" w:date="2026-10-12T07:18:07Z">
         <w:r>
           <w:delText xml:space="preserve">(4) bí mật nhà nước, tài liệu mật - không đưa vào nền tảng AI dưới mọi hình thức.</w:delText>
         </w:r>
       </w:del>
-      <w:ins w:id="1032" w:author="Tiếp thu thẩm định lần 2, 12/10 (Claude)" w:date="2026-10-12T07:12:04Z">
+      <w:ins w:id="1034" w:author="Tiếp thu thẩm định lần 2, 12/10 (Claude)" w:date="2026-10-12T07:18:07Z">
         <w:r>
           <w:t xml:space="preserve">(4) bí mật nhà nước, tài liệu mật - không đưa vào nền tảng AI dưới mọi hình thức. Dữ liệu nhóm (2), (3) đưa vào Claude (trò chuyện, Cowork, Code) được xử lý trên hạ tầng của nhà cung cấp theo điều khoản của tài khoản Claude AI Team; ưu tiên ẩn danh, chỉ đưa phần dữ liệu cần cho việc đang làm.</w:t>
         </w:r>

</xml_diff>

<commit_message>
docs: rà soát chính thức KTC-Ra-Soat-897 v2.25 hồ sơ tiếp thu thẩm định lần 2 (0 Mức 1-3); TB, HD bản 10 sửa 01 Mức 2, 01 Mức 3, 01 Mức 4
Co-Authored-By: Claude Opus 5.5 <noreply@anthropic.com>
</commit_message>
<xml_diff>
--- a/30-Ket-Qua/2026-10-12/Soan-Thao/HD_Huong-dan-chi-tiet-su-dung-KTC-Quan-tri_20261012_v10_TrackChanges.docx
+++ b/30-Ket-Qua/2026-10-12/Soan-Thao/HD_Huong-dan-chi-tiet-su-dung-KTC-Quan-tri_20261012_v10_TrackChanges.docx
@@ -2388,12 +2388,12 @@
       <w:r>
         <w:t xml:space="preserve">KTC-Quan-tri là bộ công cụ trí tuệ nhân tạo hỗ trợ chu trình quản trị nhiệm vụ khép kín của Trường: Kế hoạch - giao việc - theo dõi - kết quả, minh chứng - báo cáo - đánh giá. Bộ công cụ dùng chung kho KTC-Database, mẫu Phụ lục Thông báo số 736/TB-CĐKT ngày 25/6/2026, 6 trục kết quả trọng tâm theo Thông báo số 817/TB-CĐKT ngày 14/7/2026 </w:t>
       </w:r>
-      <w:del w:id="1003" w:author="Tiếp thu thẩm định lần 2, 12/10 (Claude)" w:date="2026-10-12T07:18:07Z">
+      <w:del w:id="1005" w:author="Tiếp thu thẩm định lần 2, 12/10 (Claude)" w:date="2026-10-12T07:20:26Z">
         <w:r>
           <w:delText xml:space="preserve">và mã nhiệm vụ (Task_ID) thống nhất từ kế hoạch đến báo cáo.</w:delText>
         </w:r>
       </w:del>
-      <w:ins w:id="1004" w:author="Tiếp thu thẩm định lần 2, 12/10 (Claude)" w:date="2026-10-12T07:18:07Z">
+      <w:ins w:id="1006" w:author="Tiếp thu thẩm định lần 2, 12/10 (Claude)" w:date="2026-10-12T07:20:26Z">
         <w:r>
           <w:t xml:space="preserve">và mã sản phẩm, công việc theo Danh mục sản phẩm, công việc ban hành kèm theo Quyết định số 2119/QĐ-CĐKT ngày 28/9/2026; mã nhiệm vụ thống nhất (Task_ID) chưa áp dụng cho đến khi Trường ban hành quy định mã nhiệm vụ phù hợp với mã nhiệm vụ trên phần mềm KPI của tỉnh (Hệ thống quản lý đánh giá, xếp loại chất lượng cán bộ, công chức, viên chức VNPT-ĐGCB), trong thời gian này nhiệm vụ được đối chiếu theo mã sản phẩm và tên nhiệm vụ.</w:t>
         </w:r>
@@ -2786,7 +2786,7 @@
             <w:pPr>
               <w:spacing w:before="40" w:after="40" w:line="252" w:lineRule="auto"/>
             </w:pPr>
-            <w:del w:id="1005" w:author="Tiếp thu thẩm định lần 2, 12/10 (Claude)" w:date="2026-10-12T07:18:07Z">
+            <w:del w:id="1007" w:author="Tiếp thu thẩm định lần 2, 12/10 (Claude)" w:date="2026-10-12T07:20:26Z">
               <w:r>
                 <w:rPr>
                   <w:sz w:val="24"/>
@@ -2795,7 +2795,7 @@
                 <w:delText xml:space="preserve">Chuẩn hóa nhiệm vụ, cấp Task_ID, phân loại trục</w:delText>
               </w:r>
             </w:del>
-            <w:ins w:id="1006" w:author="Tiếp thu thẩm định lần 2, 12/10 (Claude)" w:date="2026-10-12T07:18:07Z">
+            <w:ins w:id="1008" w:author="Tiếp thu thẩm định lần 2, 12/10 (Claude)" w:date="2026-10-12T07:20:26Z">
               <w:r>
                 <w:rPr>
                   <w:sz w:val="24"/>
@@ -3504,7 +3504,7 @@
               </w:rPr>
               <w:t xml:space="preserve">Tự chạy khi mở, kết thúc phiên và sau khi tạo tệp: In phiên bản và tự thử thao tác chặn ghi; chặn thao tác ghi, xóa đã nhận dạng được vào kho KTC-Database, 03-Templates(1), 04-Good-Documents, </w:t>
             </w:r>
-            <w:del w:id="1021" w:author="Tiếp thu thẩm định lần 2, 12/10 (Claude)" w:date="2026-10-12T07:18:07Z">
+            <w:del w:id="1023" w:author="Tiếp thu thẩm định lần 2, 12/10 (Claude)" w:date="2026-10-12T07:20:26Z">
               <w:r>
                 <w:rPr>
                   <w:sz w:val="24"/>
@@ -3513,7 +3513,7 @@
                 <w:delText xml:space="preserve">kể cả thao tác không xác định được nơi ghi; đo thể thức</w:delText>
               </w:r>
             </w:del>
-            <w:ins w:id="1022" w:author="Tiếp thu thẩm định lần 2, 12/10 (Claude)" w:date="2026-10-12T07:18:07Z">
+            <w:ins w:id="1024" w:author="Tiếp thu thẩm định lần 2, 12/10 (Claude)" w:date="2026-10-12T07:20:26Z">
               <w:r>
                 <w:rPr>
                   <w:sz w:val="24"/>
@@ -4086,12 +4086,12 @@
         <w:ind w:firstLine="720"/>
         <w:jc w:val="both"/>
       </w:pPr>
-      <w:del w:id="1023" w:author="Tiếp thu thẩm định lần 2, 12/10 (Claude)" w:date="2026-10-12T07:18:07Z">
+      <w:del w:id="1025" w:author="Tiếp thu thẩm định lần 2, 12/10 (Claude)" w:date="2026-10-12T07:20:26Z">
         <w:r>
           <w:delText xml:space="preserve">Kết quả kiểm thử gắn với phiên bản, mô hình đã chạy.</w:delText>
         </w:r>
       </w:del>
-      <w:ins w:id="1024" w:author="Tiếp thu thẩm định lần 2, 12/10 (Claude)" w:date="2026-10-12T07:18:07Z">
+      <w:ins w:id="1026" w:author="Tiếp thu thẩm định lần 2, 12/10 (Claude)" w:date="2026-10-12T07:20:26Z">
         <w:r>
           <w:t xml:space="preserve">Kết quả thử nghiệm sơ bộ, gắn với phiên bản, mô hình đã chạy; không phải chứng nhận độ tin cậy trong vận hành.</w:t>
         </w:r>
@@ -4449,12 +4449,12 @@
       <w:r>
         <w:t xml:space="preserve">Chọn marketplace có sẵn hoặc tạo mới (ví dụ: KTC); kéo thả hoặc chọn tệp ktc-quan-tri-&lt;phiên bản&gt;.zip </w:t>
       </w:r>
-      <w:del w:id="1025" w:author="Tiếp thu thẩm định lần 2, 12/10 (Claude)" w:date="2026-10-12T07:18:07Z">
+      <w:del w:id="1027" w:author="Tiếp thu thẩm định lần 2, 12/10 (Claude)" w:date="2026-10-12T07:20:26Z">
         <w:r>
           <w:delText xml:space="preserve">(tối đa 50 MB)</w:delText>
         </w:r>
       </w:del>
-      <w:ins w:id="1026" w:author="Tiếp thu thẩm định lần 2, 12/10 (Claude)" w:date="2026-10-12T07:18:07Z">
+      <w:ins w:id="1028" w:author="Tiếp thu thẩm định lần 2, 12/10 (Claude)" w:date="2026-10-12T07:20:26Z">
         <w:r>
           <w:t xml:space="preserve">(dưới 200 MB)</w:t>
         </w:r>
@@ -4491,12 +4491,12 @@
         </w:rPr>
         <w:t xml:space="preserve">Bước 4 - cập nhật: </w:t>
       </w:r>
-      <w:del w:id="1027" w:author="Tiếp thu thẩm định lần 2, 12/10 (Claude)" w:date="2026-10-12T07:18:07Z">
+      <w:del w:id="1029" w:author="Tiếp thu thẩm định lần 2, 12/10 (Claude)" w:date="2026-10-12T07:20:26Z">
         <w:r>
           <w:delText xml:space="preserve">Gỡ phiên bản cũ trước, tải phiên bản mới, thông báo</w:delText>
         </w:r>
       </w:del>
-      <w:ins w:id="1028" w:author="Tiếp thu thẩm định lần 2, 12/10 (Claude)" w:date="2026-10-12T07:18:07Z">
+      <w:ins w:id="1030" w:author="Tiếp thu thẩm định lần 2, 12/10 (Claude)" w:date="2026-10-12T07:20:26Z">
         <w:r>
           <w:t xml:space="preserve">Tải tệp phiên bản mới cùng tên lên (hệ thống tự ghi đè phiên bản trước, không cần gỡ), thông báo</w:t>
         </w:r>
@@ -4504,12 +4504,12 @@
       <w:r>
         <w:t xml:space="preserve"> người dùng mở cuộc hội thoại mới. Không để song song hai phiên bản. Phiên bản mới phát sinh lỗi: </w:t>
       </w:r>
-      <w:del w:id="1029" w:author="Tiếp thu thẩm định lần 2, 12/10 (Claude)" w:date="2026-10-12T07:18:07Z">
+      <w:del w:id="1031" w:author="Tiếp thu thẩm định lần 2, 12/10 (Claude)" w:date="2026-10-12T07:20:26Z">
         <w:r>
           <w:delText xml:space="preserve">Gỡ phiên bản đó, cài lại phiên bản liền trước</w:delText>
         </w:r>
       </w:del>
-      <w:ins w:id="1030" w:author="Tiếp thu thẩm định lần 2, 12/10 (Claude)" w:date="2026-10-12T07:18:07Z">
+      <w:ins w:id="1032" w:author="Tiếp thu thẩm định lần 2, 12/10 (Claude)" w:date="2026-10-12T07:20:26Z">
         <w:r>
           <w:t xml:space="preserve">Tải lại tệp phiên bản liền trước</w:t>
         </w:r>
@@ -4535,7 +4535,20 @@
         <w:jc w:val="both"/>
       </w:pPr>
       <w:r>
-        <w:t>Bước 5 - khi nạp phiên bản mới: Chuyển phiên bản cũ đang có ở cấp tổ chức sang chế độ “Not available”. Tắt ở một máy không có nghĩa là đã gỡ ở cấp tổ chức.</w:t>
+        <w:t xml:space="preserve">Bước 5 - khi nạp phiên bản mới: </w:t>
+      </w:r>
+      <w:del w:id="1001" w:author="Tiếp thu thẩm định lần 2, 12/10 (Claude)" w:date="2026-10-12T07:20:25Z">
+        <w:r>
+          <w:delText xml:space="preserve">Chuyển phiên bản cũ đang có ở cấp tổ chức sang chế độ “Not available”.</w:delText>
+        </w:r>
+      </w:del>
+      <w:ins w:id="1002" w:author="Tiếp thu thẩm định lần 2, 12/10 (Claude)" w:date="2026-10-12T07:20:25Z">
+        <w:r>
+          <w:t xml:space="preserve">Kiểm tra tại thẻ Inventory chỉ còn một plugin KTC-Quan-tri (tải lên cùng tên thì bản cũ được ghi đè); plugin, kỹ năng KTC cũ mang tên khác chuyển sang chế độ “Not available”.</w:t>
+        </w:r>
+      </w:ins>
+      <w:r>
+        <w:t xml:space="preserve"> Tắt ở một máy không có nghĩa là đã gỡ ở cấp tổ chức.</w:t>
       </w:r>
     </w:p>
     <w:p>
@@ -5194,7 +5207,7 @@
               </w:rPr>
               <w:t xml:space="preserve">Chỉ có phần hướng dẫn của kỹ năng; không có tác tử kiểm tra, thao tác tự động; không bảo đảm chạy được công cụ tính toán; chỉ đối chiếu được KTC-Database khi đã kết nối Google Drive. </w:t>
             </w:r>
-            <w:del w:id="1035" w:author="Tiếp thu thẩm định lần 2, 12/10 (Claude)" w:date="2026-10-12T07:18:07Z">
+            <w:del w:id="1037" w:author="Tiếp thu thẩm định lần 2, 12/10 (Claude)" w:date="2026-10-12T07:20:26Z">
               <w:r>
                 <w:rPr>
                   <w:sz w:val="24"/>
@@ -5203,7 +5216,7 @@
                 <w:delText xml:space="preserve">Kết quả chỉ dùng đối chiếu chéo, không thay kết quả trên Claude.</w:delText>
               </w:r>
             </w:del>
-            <w:ins w:id="1036" w:author="Tiếp thu thẩm định lần 2, 12/10 (Claude)" w:date="2026-10-12T07:18:07Z">
+            <w:ins w:id="1038" w:author="Tiếp thu thẩm định lần 2, 12/10 (Claude)" w:date="2026-10-12T07:20:26Z">
               <w:r>
                 <w:rPr>
                   <w:sz w:val="24"/>
@@ -5483,12 +5496,12 @@
       <w:r>
         <w:t xml:space="preserve">Mã cảnh báo thường gặp: THIEU_DU_LIEU (thiếu nguồn); NGHI_CHI_DAN_TRONG_DU_LIEU (tệp có câu lệnh bất thường - kiểm tra lại nguồn tệp); DOI_CHIEU_GAN_DUNG (đối chiếu theo tên, chưa theo Task_ID - đơn vị đối chiếu thủ công toàn bộ với dữ liệu gốc trước khi Lãnh đạo đơn vị ký duyệt); FORMAT_BINARY_UNVERIFIED (chưa đo được thể thức - người dùng mở tệp trong Word, kiểm tra khổ A4, lề trên 2 - dưới 2 - trái 3 - phải 2 cm, phông Times New Roman cỡ 14, số trang ở giữa lề trên trước khi trình); THANG_DIEM_CHUA_PHAN_DINH (phép nhân hệ số sản phẩm theo Danh mục ban hành kèm Quyết định số 2119/QĐ-CĐKT với hệ số mức độ công việc </w:t>
       </w:r>
-      <w:del w:id="1001" w:author="Tiếp thu thẩm định lần 2, 12/10 (Claude)" w:date="2026-10-12T07:18:07Z">
+      <w:del w:id="1003" w:author="Tiếp thu thẩm định lần 2, 12/10 (Claude)" w:date="2026-10-12T07:20:26Z">
         <w:r>
           <w:delText xml:space="preserve">không áp dụng: Theo ý kiến của Phòng TCCB&amp;CTHSSV ngày 06/10/2026, từ Quý IV/2026</w:delText>
         </w:r>
       </w:del>
-      <w:ins w:id="1002" w:author="Tiếp thu thẩm định lần 2, 12/10 (Claude)" w:date="2026-10-12T07:18:07Z">
+      <w:ins w:id="1004" w:author="Tiếp thu thẩm định lần 2, 12/10 (Claude)" w:date="2026-10-12T07:20:26Z">
         <w:r>
           <w:t xml:space="preserve">không áp dụng: Từ Quý IV/2026</w:t>
         </w:r>
@@ -6497,7 +6510,7 @@
               </w:rPr>
               <w:t xml:space="preserve">Dùng bộ công cụ KTC-Quan-tri, kỹ năng theo dõi nhiệm vụ (theo-doi-cv). Đầu vào: </w:t>
             </w:r>
-            <w:del w:id="1007" w:author="Tiếp thu thẩm định lần 2, 12/10 (Claude)" w:date="2026-10-12T07:18:07Z">
+            <w:del w:id="1009" w:author="Tiếp thu thẩm định lần 2, 12/10 (Claude)" w:date="2026-10-12T07:20:26Z">
               <w:r>
                 <w:rPr>
                   <w:sz w:val="24"/>
@@ -6506,7 +6519,7 @@
                 <w:delText xml:space="preserve">[danh sách nhiệm vụ có Task_ID]</w:delText>
               </w:r>
             </w:del>
-            <w:ins w:id="1008" w:author="Tiếp thu thẩm định lần 2, 12/10 (Claude)" w:date="2026-10-12T07:18:07Z">
+            <w:ins w:id="1010" w:author="Tiếp thu thẩm định lần 2, 12/10 (Claude)" w:date="2026-10-12T07:20:26Z">
               <w:r>
                 <w:rPr>
                   <w:sz w:val="24"/>
@@ -7107,7 +7120,7 @@
               </w:rPr>
               <w:t xml:space="preserve">Dùng bộ công cụ KTC-Quan-tri, kỹ năng soạn thảo văn bản (soan-thao-vb) và chuẩn thể thức (the-thuc). Loại văn bản: [..]; nội dung chính: [..]; người ký: [..]; nơi nhận: [..]. Yêu cầu: (1) tìm văn bản cùng loại đã ban hành trong KTC-Database làm nền; (2) căn cứ lấy từ kho, ghi đúng số hiệu, ngày ban hành; </w:t>
             </w:r>
-            <w:del w:id="1009" w:author="Tiếp thu thẩm định lần 2, 12/10 (Claude)" w:date="2026-10-12T07:18:07Z">
+            <w:del w:id="1011" w:author="Tiếp thu thẩm định lần 2, 12/10 (Claude)" w:date="2026-10-12T07:20:26Z">
               <w:r>
                 <w:rPr>
                   <w:sz w:val="24"/>
@@ -7116,7 +7129,7 @@
                 <w:delText xml:space="preserve">(3) áp dụng checklist của Skill “ktc-ra-soat-897” ngay khi viết;</w:delText>
               </w:r>
             </w:del>
-            <w:ins w:id="1010" w:author="Tiếp thu thẩm định lần 2, 12/10 (Claude)" w:date="2026-10-12T07:18:07Z">
+            <w:ins w:id="1012" w:author="Tiếp thu thẩm định lần 2, 12/10 (Claude)" w:date="2026-10-12T07:20:26Z">
               <w:r>
                 <w:rPr>
                   <w:sz w:val="24"/>
@@ -7243,7 +7256,7 @@
               </w:rPr>
               <w:t xml:space="preserve">Chuẩn hóa danh sách nhiệm vụ đính kèm: </w:t>
             </w:r>
-            <w:del w:id="1011" w:author="Tiếp thu thẩm định lần 2, 12/10 (Claude)" w:date="2026-10-12T07:18:07Z">
+            <w:del w:id="1013" w:author="Tiếp thu thẩm định lần 2, 12/10 (Claude)" w:date="2026-10-12T07:20:26Z">
               <w:r>
                 <w:rPr>
                   <w:sz w:val="24"/>
@@ -7252,7 +7265,7 @@
                 <w:delText xml:space="preserve">Cấp Task_ID, chuẩn hóa mã đơn vị</w:delText>
               </w:r>
             </w:del>
-            <w:ins w:id="1012" w:author="Tiếp thu thẩm định lần 2, 12/10 (Claude)" w:date="2026-10-12T07:18:07Z">
+            <w:ins w:id="1014" w:author="Tiếp thu thẩm định lần 2, 12/10 (Claude)" w:date="2026-10-12T07:20:26Z">
               <w:r>
                 <w:rPr>
                   <w:sz w:val="24"/>
@@ -7352,7 +7365,7 @@
               </w:rPr>
               <w:t xml:space="preserve">Dùng bộ công cụ KTC-Quan-tri, kỹ năng quản trị (quan-tri). Đầu vào: [kết luận giao ban/văn bản giao việc/danh sách nhiệm vụ]. Yêu cầu: (1) tách từng nhiệm vụ: Nội dung, đơn vị chủ trì, phối hợp, sản phẩm, thời hạn, căn cứ; (2) kiểm tra trùng với nhiệm vụ đã có; </w:t>
             </w:r>
-            <w:del w:id="1013" w:author="Tiếp thu thẩm định lần 2, 12/10 (Claude)" w:date="2026-10-12T07:18:07Z">
+            <w:del w:id="1015" w:author="Tiếp thu thẩm định lần 2, 12/10 (Claude)" w:date="2026-10-12T07:20:26Z">
               <w:r>
                 <w:rPr>
                   <w:sz w:val="24"/>
@@ -7361,7 +7374,7 @@
                 <w:delText xml:space="preserve">(3) cấp Task_ID (dạng KTC-2026-Q4-00125) cho nhiệm vụ mới;</w:delText>
               </w:r>
             </w:del>
-            <w:ins w:id="1014" w:author="Tiếp thu thẩm định lần 2, 12/10 (Claude)" w:date="2026-10-12T07:18:07Z">
+            <w:ins w:id="1016" w:author="Tiếp thu thẩm định lần 2, 12/10 (Claude)" w:date="2026-10-12T07:20:26Z">
               <w:r>
                 <w:rPr>
                   <w:sz w:val="24"/>
@@ -7572,7 +7585,7 @@
               </w:rPr>
               <w:t xml:space="preserve">Dùng bộ công cụ KTC-Quan-tri, tác tử kiểm hồ sơ đơn vị (ktc-kiem-ho-so-don-vi), mỗi đơn vị một lượt. Kiểm đúng mẫu Phụ lục Thông báo số 736/TB-CĐKT, </w:t>
             </w:r>
-            <w:del w:id="1015" w:author="Tiếp thu thẩm định lần 2, 12/10 (Claude)" w:date="2026-10-12T07:18:07Z">
+            <w:del w:id="1017" w:author="Tiếp thu thẩm định lần 2, 12/10 (Claude)" w:date="2026-10-12T07:20:26Z">
               <w:r>
                 <w:rPr>
                   <w:sz w:val="24"/>
@@ -7581,7 +7594,7 @@
                 <w:delText xml:space="preserve">cột Task_ID, mã đơn vị chuẩn</w:delText>
               </w:r>
             </w:del>
-            <w:ins w:id="1016" w:author="Tiếp thu thẩm định lần 2, 12/10 (Claude)" w:date="2026-10-12T07:18:07Z">
+            <w:ins w:id="1018" w:author="Tiếp thu thẩm định lần 2, 12/10 (Claude)" w:date="2026-10-12T07:20:26Z">
               <w:r>
                 <w:rPr>
                   <w:sz w:val="24"/>
@@ -7851,7 +7864,7 @@
             <w:pPr>
               <w:spacing w:before="40" w:after="40" w:line="252" w:lineRule="auto"/>
             </w:pPr>
-            <w:del w:id="1017" w:author="Tiếp thu thẩm định lần 2, 12/10 (Claude)" w:date="2026-10-12T07:18:07Z">
+            <w:del w:id="1019" w:author="Tiếp thu thẩm định lần 2, 12/10 (Claude)" w:date="2026-10-12T07:20:26Z">
               <w:r>
                 <w:rPr>
                   <w:sz w:val="24"/>
@@ -7860,7 +7873,7 @@
                 <w:delText xml:space="preserve">Danh sách nhiệm vụ có Task_ID;</w:delText>
               </w:r>
             </w:del>
-            <w:ins w:id="1018" w:author="Tiếp thu thẩm định lần 2, 12/10 (Claude)" w:date="2026-10-12T07:18:07Z">
+            <w:ins w:id="1020" w:author="Tiếp thu thẩm định lần 2, 12/10 (Claude)" w:date="2026-10-12T07:20:26Z">
               <w:r>
                 <w:rPr>
                   <w:sz w:val="24"/>
@@ -8228,7 +8241,7 @@
             <w:pPr>
               <w:spacing w:before="40" w:after="40" w:line="252" w:lineRule="auto"/>
             </w:pPr>
-            <w:del w:id="1019" w:author="Tiếp thu thẩm định lần 2, 12/10 (Claude)" w:date="2026-10-12T07:18:07Z">
+            <w:del w:id="1021" w:author="Tiếp thu thẩm định lần 2, 12/10 (Claude)" w:date="2026-10-12T07:20:26Z">
               <w:r>
                 <w:rPr>
                   <w:sz w:val="24"/>
@@ -8237,7 +8250,7 @@
                 <w:delText>Task_ID dạng KTC-2026-Q4-00125, dùng xuyên suốt kế hoạch, theo dõi, báo cáo, minh chứng.</w:delText>
               </w:r>
             </w:del>
-            <w:ins w:id="1020" w:author="Tiếp thu thẩm định lần 2, 12/10 (Claude)" w:date="2026-10-12T07:18:07Z">
+            <w:ins w:id="1022" w:author="Tiếp thu thẩm định lần 2, 12/10 (Claude)" w:date="2026-10-12T07:20:26Z">
               <w:r>
                 <w:rPr>
                   <w:sz w:val="24"/>
@@ -8610,7 +8623,7 @@
             <w:pPr>
               <w:spacing w:before="40" w:after="40" w:line="252" w:lineRule="auto"/>
             </w:pPr>
-            <w:del w:id="1031" w:author="Tiếp thu thẩm định lần 2, 12/10 (Claude)" w:date="2026-10-12T07:18:07Z">
+            <w:del w:id="1033" w:author="Tiếp thu thẩm định lần 2, 12/10 (Claude)" w:date="2026-10-12T07:20:26Z">
               <w:r>
                 <w:rPr>
                   <w:sz w:val="24"/>
@@ -8619,7 +8632,7 @@
                 <w:delText>Gỡ bản cũ, chỉ giữ bản mới nhất; mở cuộc hội thoại mới.</w:delText>
               </w:r>
             </w:del>
-            <w:ins w:id="1032" w:author="Tiếp thu thẩm định lần 2, 12/10 (Claude)" w:date="2026-10-12T07:18:07Z">
+            <w:ins w:id="1034" w:author="Tiếp thu thẩm định lần 2, 12/10 (Claude)" w:date="2026-10-12T07:20:26Z">
               <w:r>
                 <w:rPr>
                   <w:sz w:val="24"/>
@@ -9093,12 +9106,12 @@
       <w:r>
         <w:t xml:space="preserve">- Phân loại dữ liệu: (1) văn bản đã ban hành, công khai - được dùng; (2) dữ liệu nội bộ (kế hoạch, báo cáo đơn vị) - chỉ dùng trong tài khoản Claude AI Team của Trường; (3) dữ liệu cá nhân (điểm, nhận xét, xếp loại) - chỉ người được đánh giá và người có thẩm quyền xử lý, trong tài khoản Claude AI Team của Trường, tối thiểu hóa, không dùng #học; </w:t>
       </w:r>
-      <w:del w:id="1033" w:author="Tiếp thu thẩm định lần 2, 12/10 (Claude)" w:date="2026-10-12T07:18:07Z">
+      <w:del w:id="1035" w:author="Tiếp thu thẩm định lần 2, 12/10 (Claude)" w:date="2026-10-12T07:20:26Z">
         <w:r>
           <w:delText xml:space="preserve">(4) bí mật nhà nước, tài liệu mật - không đưa vào nền tảng AI dưới mọi hình thức.</w:delText>
         </w:r>
       </w:del>
-      <w:ins w:id="1034" w:author="Tiếp thu thẩm định lần 2, 12/10 (Claude)" w:date="2026-10-12T07:18:07Z">
+      <w:ins w:id="1036" w:author="Tiếp thu thẩm định lần 2, 12/10 (Claude)" w:date="2026-10-12T07:20:26Z">
         <w:r>
           <w:t xml:space="preserve">(4) bí mật nhà nước, tài liệu mật - không đưa vào nền tảng AI dưới mọi hình thức. Dữ liệu nhóm (2), (3) đưa vào Claude (trò chuyện, Cowork, Code) được xử lý trên hạ tầng của nhà cung cấp theo điều khoản của tài khoản Claude AI Team; ưu tiên ẩn danh, chỉ đưa phần dữ liệu cần cho việc đang làm.</w:t>
         </w:r>

</xml_diff>